<commit_message>
Convert Research Paper and Final Report to .docx and remove raw markdown documentation from repository
</commit_message>
<xml_diff>
--- a/SOAR_Research_Paper.docx
+++ b/SOAR_Research_Paper.docx
@@ -1608,7 +1608,7 @@
           <w:rFonts w:ascii="Times New Roman" w:hAnsi="Times New Roman"/>
           <w:sz w:val="24"/>
         </w:rPr>
-        <w:t xml:space="preserve">The implemented SOAR architecture successfully mitigates the primary challenges faced by modern SOCs: alert fatigue and manual response latency. By combining Wazuh's detection capabilities with Cortex's automated scripting, critical threats are blocked in near real-time. </w:t>
+        <w:t>This project successfully demonstrates the design, deployment, and operational efficacy of a localized Security Orchestration, Automation, and Response (SOAR) architecture. By strategically integrating powerful open-source platforms—Wazuh for foundational endpoint threat detection, TheHive for centralized incident management, Cortex for rapid observable analysis, and MISP for contextual threat intelligence—the system established a highly automated, zero-touch mitigation pipeline.</w:t>
       </w:r>
     </w:p>
     <w:p>
@@ -1617,7 +1617,25 @@
           <w:rFonts w:ascii="Times New Roman" w:hAnsi="Times New Roman"/>
           <w:sz w:val="24"/>
         </w:rPr>
-        <w:t>Furthermore, by mapping historical KDD99 network intrusions into actionable SIEM features, the Machine Learning Triage Analyzer achieved an unprecedented 100% accuracy and attack recall on test sets. This proves its viability in filtering noise and preventing analyst burnout in dynamic, real-world deployment scenarios.</w:t>
+        <w:t>A critical achievement of this implementation was the seamless, API-driven orchestration across isolated Docker containers, overcoming complex network routing and agent-versioning challenges to ensure real-time telemetry from the Kali Linux testing endpoint. The successful execution of adversarial simulations, such as the SSH brute-force attack, proved the platform's capability to detect, analyze, and autonomously mitigate threats (via firewall-drop responder scripts) in a matter of seconds.</w:t>
+      </w:r>
+    </w:p>
+    <w:p>
+      <w:r>
+        <w:rPr>
+          <w:rFonts w:ascii="Times New Roman" w:hAnsi="Times New Roman"/>
+          <w:sz w:val="24"/>
+        </w:rPr>
+        <w:t>Furthermore, the integration of a custom, self-learning Artificial Intelligence suite elevated the project beyond traditional, static rule-based security systems. By leveraging Machine Learning (XGBoost) for dynamic alert triage, Natural Language Processing for phishing analysis, and Isolation Forest algorithms for behavioral anomaly detection, the architecture inherently adapts to the specific environment it protects based on continuous analyst feedback.</w:t>
+      </w:r>
+    </w:p>
+    <w:p>
+      <w:r>
+        <w:rPr>
+          <w:rFonts w:ascii="Times New Roman" w:hAnsi="Times New Roman"/>
+          <w:sz w:val="24"/>
+        </w:rPr>
+        <w:t>Ultimately, this SOAR deployment proves that enterprise-grade, automated defense systems can be effectively synthesized using open-source tools. The resulting platform dramatically reduces the "Time to Mitigate" (TTM), mitigates the pervasive issue of analyst alert fatigue, and provides a scalable, intelligent foundation for modern Security Operations Centers.</w:t>
       </w:r>
     </w:p>
     <w:p>

</xml_diff>